<commit_message>
Client gate guide: table of contents added
A table of contents on page 2, after the cover: the eight sections and the
twelve gates, each entry linked to its heading (20 new _Toc bookmarks). Page
numbers are left for Word: the field is marked dirty, so Word computes them on
opening. Adds the TOC Heading, toc 1 and toc 2 styles the guide lacked.

Co-Authored-By: Claude Opus 5.5 <noreply@anthropic.com>
</commit_message>
<xml_diff>
--- a/gex-platform-enhanced/docs/WHY  12GATES-easily explained.docx
+++ b/gex-platform-enhanced/docs/WHY  12GATES-easily explained.docx
@@ -144,14 +144,558 @@
     </w:p>
     <w:p>
       <w:pPr>
+        <w:pStyle w:val="TOCHeading"/>
+      </w:pPr>
+      <w:r>
+        <w:t>Contents</w:t>
+      </w:r>
+    </w:p>
+    <w:p>
+      <w:pPr>
+        <w:pStyle w:val="TOC1"/>
+        <w:tabs>
+          <w:tab w:val="right" w:leader="dot" w:pos="9350"/>
+        </w:tabs>
+      </w:pPr>
+      <w:r>
+        <w:rPr>
+          <w:noProof/>
+        </w:rPr>
+        <w:fldChar w:fldCharType="begin" w:dirty="true"/>
+        <w:instrText xml:space="preserve"> TOC \o "1-2" \h \z \u </w:instrText>
+        <w:fldChar w:fldCharType="separate"/>
+      </w:r>
+      <w:hyperlink w:anchor="_Toc2610221000" w:history="1">
+        <w:r>
+          <w:rPr>
+            <w:noProof/>
+          </w:rPr>
+          <w:t>1. Why the gates exist</w:t>
+        </w:r>
+        <w:r>
+          <w:rPr>
+            <w:noProof/>
+          </w:rPr>
+          <w:tab/>
+          <w:fldChar w:fldCharType="begin"/>
+          <w:instrText xml:space="preserve"> PAGEREF _Toc2610221000 \h </w:instrText>
+          <w:fldChar w:fldCharType="separate"/>
+          <w:fldChar w:fldCharType="end"/>
+        </w:r>
+      </w:hyperlink>
+    </w:p>
+    <w:p>
+      <w:pPr>
+        <w:pStyle w:val="TOC1"/>
+        <w:tabs>
+          <w:tab w:val="right" w:leader="dot" w:pos="9350"/>
+        </w:tabs>
+      </w:pPr>
+      <w:hyperlink w:anchor="_Toc2610221001" w:history="1">
+        <w:r>
+          <w:rPr>
+            <w:noProof/>
+          </w:rPr>
+          <w:t>2. How a gate works in GEX</w:t>
+        </w:r>
+        <w:r>
+          <w:rPr>
+            <w:noProof/>
+          </w:rPr>
+          <w:tab/>
+          <w:fldChar w:fldCharType="begin"/>
+          <w:instrText xml:space="preserve"> PAGEREF _Toc2610221001 \h </w:instrText>
+          <w:fldChar w:fldCharType="separate"/>
+          <w:fldChar w:fldCharType="end"/>
+        </w:r>
+      </w:hyperlink>
+    </w:p>
+    <w:p>
+      <w:pPr>
+        <w:pStyle w:val="TOC1"/>
+        <w:tabs>
+          <w:tab w:val="right" w:leader="dot" w:pos="9350"/>
+        </w:tabs>
+      </w:pPr>
+      <w:hyperlink w:anchor="_Toc2610221002" w:history="1">
+        <w:r>
+          <w:rPr>
+            <w:noProof/>
+          </w:rPr>
+          <w:t>3. Document stages</w:t>
+        </w:r>
+        <w:r>
+          <w:rPr>
+            <w:noProof/>
+          </w:rPr>
+          <w:tab/>
+          <w:fldChar w:fldCharType="begin"/>
+          <w:instrText xml:space="preserve"> PAGEREF _Toc2610221002 \h </w:instrText>
+          <w:fldChar w:fldCharType="separate"/>
+          <w:fldChar w:fldCharType="end"/>
+        </w:r>
+      </w:hyperlink>
+    </w:p>
+    <w:p>
+      <w:pPr>
+        <w:pStyle w:val="TOC1"/>
+        <w:tabs>
+          <w:tab w:val="right" w:leader="dot" w:pos="9350"/>
+        </w:tabs>
+      </w:pPr>
+      <w:hyperlink w:anchor="_Toc2610221003" w:history="1">
+        <w:r>
+          <w:rPr>
+            <w:noProof/>
+          </w:rPr>
+          <w:t>4. The path from idea to operation</w:t>
+        </w:r>
+        <w:r>
+          <w:rPr>
+            <w:noProof/>
+          </w:rPr>
+          <w:tab/>
+          <w:fldChar w:fldCharType="begin"/>
+          <w:instrText xml:space="preserve"> PAGEREF _Toc2610221003 \h </w:instrText>
+          <w:fldChar w:fldCharType="separate"/>
+          <w:fldChar w:fldCharType="end"/>
+        </w:r>
+      </w:hyperlink>
+    </w:p>
+    <w:p>
+      <w:pPr>
+        <w:pStyle w:val="TOC1"/>
+        <w:tabs>
+          <w:tab w:val="right" w:leader="dot" w:pos="9350"/>
+        </w:tabs>
+      </w:pPr>
+      <w:hyperlink w:anchor="_Toc2610221004" w:history="1">
+        <w:r>
+          <w:rPr>
+            <w:noProof/>
+          </w:rPr>
+          <w:t>5. What GEX checks beyond documents</w:t>
+        </w:r>
+        <w:r>
+          <w:rPr>
+            <w:noProof/>
+          </w:rPr>
+          <w:tab/>
+          <w:fldChar w:fldCharType="begin"/>
+          <w:instrText xml:space="preserve"> PAGEREF _Toc2610221004 \h </w:instrText>
+          <w:fldChar w:fldCharType="separate"/>
+          <w:fldChar w:fldCharType="end"/>
+        </w:r>
+      </w:hyperlink>
+    </w:p>
+    <w:p>
+      <w:pPr>
+        <w:pStyle w:val="TOC1"/>
+        <w:tabs>
+          <w:tab w:val="right" w:leader="dot" w:pos="9350"/>
+        </w:tabs>
+      </w:pPr>
+      <w:hyperlink w:anchor="_Toc2610221005" w:history="1">
+        <w:r>
+          <w:rPr>
+            <w:noProof/>
+          </w:rPr>
+          <w:t>6. The twelve gates</w:t>
+        </w:r>
+        <w:r>
+          <w:rPr>
+            <w:noProof/>
+          </w:rPr>
+          <w:tab/>
+          <w:fldChar w:fldCharType="begin"/>
+          <w:instrText xml:space="preserve"> PAGEREF _Toc2610221005 \h </w:instrText>
+          <w:fldChar w:fldCharType="separate"/>
+          <w:fldChar w:fldCharType="end"/>
+        </w:r>
+      </w:hyperlink>
+    </w:p>
+    <w:p>
+      <w:pPr>
+        <w:pStyle w:val="TOC2"/>
+        <w:tabs>
+          <w:tab w:val="right" w:leader="dot" w:pos="9350"/>
+        </w:tabs>
+      </w:pPr>
+      <w:hyperlink w:anchor="_Toc2610221006" w:history="1">
+        <w:r>
+          <w:rPr>
+            <w:noProof/>
+          </w:rPr>
+          <w:t>G0 · Site Rights &amp; Social License</w:t>
+        </w:r>
+        <w:r>
+          <w:rPr>
+            <w:noProof/>
+          </w:rPr>
+          <w:tab/>
+          <w:fldChar w:fldCharType="begin"/>
+          <w:instrText xml:space="preserve"> PAGEREF _Toc2610221006 \h </w:instrText>
+          <w:fldChar w:fldCharType="separate"/>
+          <w:fldChar w:fldCharType="end"/>
+        </w:r>
+      </w:hyperlink>
+    </w:p>
+    <w:p>
+      <w:pPr>
+        <w:pStyle w:val="TOC2"/>
+        <w:tabs>
+          <w:tab w:val="right" w:leader="dot" w:pos="9350"/>
+        </w:tabs>
+      </w:pPr>
+      <w:hyperlink w:anchor="_Toc2610221007" w:history="1">
+        <w:r>
+          <w:rPr>
+            <w:noProof/>
+          </w:rPr>
+          <w:t>G1 · Power, Utilities &amp; Technology Basis</w:t>
+        </w:r>
+        <w:r>
+          <w:rPr>
+            <w:noProof/>
+          </w:rPr>
+          <w:tab/>
+          <w:fldChar w:fldCharType="begin"/>
+          <w:instrText xml:space="preserve"> PAGEREF _Toc2610221007 \h </w:instrText>
+          <w:fldChar w:fldCharType="separate"/>
+          <w:fldChar w:fldCharType="end"/>
+        </w:r>
+      </w:hyperlink>
+    </w:p>
+    <w:p>
+      <w:pPr>
+        <w:pStyle w:val="TOC2"/>
+        <w:tabs>
+          <w:tab w:val="right" w:leader="dot" w:pos="9350"/>
+        </w:tabs>
+      </w:pPr>
+      <w:hyperlink w:anchor="_Toc2610221008" w:history="1">
+        <w:r>
+          <w:rPr>
+            <w:noProof/>
+          </w:rPr>
+          <w:t>G2 · Green Certification Pathway</w:t>
+        </w:r>
+        <w:r>
+          <w:rPr>
+            <w:noProof/>
+          </w:rPr>
+          <w:tab/>
+          <w:fldChar w:fldCharType="begin"/>
+          <w:instrText xml:space="preserve"> PAGEREF _Toc2610221008 \h </w:instrText>
+          <w:fldChar w:fldCharType="separate"/>
+          <w:fldChar w:fldCharType="end"/>
+        </w:r>
+      </w:hyperlink>
+    </w:p>
+    <w:p>
+      <w:pPr>
+        <w:pStyle w:val="TOC2"/>
+        <w:tabs>
+          <w:tab w:val="right" w:leader="dot" w:pos="9350"/>
+        </w:tabs>
+      </w:pPr>
+      <w:hyperlink w:anchor="_Toc2610221009" w:history="1">
+        <w:r>
+          <w:rPr>
+            <w:noProof/>
+          </w:rPr>
+          <w:t>G3 · Feedstock &amp; Logistics Terms</w:t>
+        </w:r>
+        <w:r>
+          <w:rPr>
+            <w:noProof/>
+          </w:rPr>
+          <w:tab/>
+          <w:fldChar w:fldCharType="begin"/>
+          <w:instrText xml:space="preserve"> PAGEREF _Toc2610221009 \h </w:instrText>
+          <w:fldChar w:fldCharType="separate"/>
+          <w:fldChar w:fldCharType="end"/>
+        </w:r>
+      </w:hyperlink>
+    </w:p>
+    <w:p>
+      <w:pPr>
+        <w:pStyle w:val="TOC2"/>
+        <w:tabs>
+          <w:tab w:val="right" w:leader="dot" w:pos="9350"/>
+        </w:tabs>
+      </w:pPr>
+      <w:hyperlink w:anchor="_Toc2610221010" w:history="1">
+        <w:r>
+          <w:rPr>
+            <w:noProof/>
+          </w:rPr>
+          <w:t>G4 · Binding Offtake</w:t>
+        </w:r>
+        <w:r>
+          <w:rPr>
+            <w:noProof/>
+          </w:rPr>
+          <w:tab/>
+          <w:fldChar w:fldCharType="begin"/>
+          <w:instrText xml:space="preserve"> PAGEREF _Toc2610221010 \h </w:instrText>
+          <w:fldChar w:fldCharType="separate"/>
+          <w:fldChar w:fldCharType="end"/>
+        </w:r>
+      </w:hyperlink>
+    </w:p>
+    <w:p>
+      <w:pPr>
+        <w:pStyle w:val="TOC2"/>
+        <w:tabs>
+          <w:tab w:val="right" w:leader="dot" w:pos="9350"/>
+        </w:tabs>
+      </w:pPr>
+      <w:hyperlink w:anchor="_Toc2610221011" w:history="1">
+        <w:r>
+          <w:rPr>
+            <w:noProof/>
+          </w:rPr>
+          <w:t>G5 · EPC Risk Priced</w:t>
+        </w:r>
+        <w:r>
+          <w:rPr>
+            <w:noProof/>
+          </w:rPr>
+          <w:tab/>
+          <w:fldChar w:fldCharType="begin"/>
+          <w:instrText xml:space="preserve"> PAGEREF _Toc2610221011 \h </w:instrText>
+          <w:fldChar w:fldCharType="separate"/>
+          <w:fldChar w:fldCharType="end"/>
+        </w:r>
+      </w:hyperlink>
+    </w:p>
+    <w:p>
+      <w:pPr>
+        <w:pStyle w:val="TOC2"/>
+        <w:tabs>
+          <w:tab w:val="right" w:leader="dot" w:pos="9350"/>
+        </w:tabs>
+      </w:pPr>
+      <w:hyperlink w:anchor="_Toc2610221012" w:history="1">
+        <w:r>
+          <w:rPr>
+            <w:noProof/>
+          </w:rPr>
+          <w:t>G6 · Independent Engineer Sign-off</w:t>
+        </w:r>
+        <w:r>
+          <w:rPr>
+            <w:noProof/>
+          </w:rPr>
+          <w:tab/>
+          <w:fldChar w:fldCharType="begin"/>
+          <w:instrText xml:space="preserve"> PAGEREF _Toc2610221012 \h </w:instrText>
+          <w:fldChar w:fldCharType="separate"/>
+          <w:fldChar w:fldCharType="end"/>
+        </w:r>
+      </w:hyperlink>
+    </w:p>
+    <w:p>
+      <w:pPr>
+        <w:pStyle w:val="TOC2"/>
+        <w:tabs>
+          <w:tab w:val="right" w:leader="dot" w:pos="9350"/>
+        </w:tabs>
+      </w:pPr>
+      <w:hyperlink w:anchor="_Toc2610221013" w:history="1">
+        <w:r>
+          <w:rPr>
+            <w:noProof/>
+          </w:rPr>
+          <w:t>G7 · Insurability Confirmed</w:t>
+        </w:r>
+        <w:r>
+          <w:rPr>
+            <w:noProof/>
+          </w:rPr>
+          <w:tab/>
+          <w:fldChar w:fldCharType="begin"/>
+          <w:instrText xml:space="preserve"> PAGEREF _Toc2610221013 \h </w:instrText>
+          <w:fldChar w:fldCharType="separate"/>
+          <w:fldChar w:fldCharType="end"/>
+        </w:r>
+      </w:hyperlink>
+    </w:p>
+    <w:p>
+      <w:pPr>
+        <w:pStyle w:val="TOC2"/>
+        <w:tabs>
+          <w:tab w:val="right" w:leader="dot" w:pos="9350"/>
+        </w:tabs>
+      </w:pPr>
+      <w:hyperlink w:anchor="_Toc2610221014" w:history="1">
+        <w:r>
+          <w:rPr>
+            <w:noProof/>
+          </w:rPr>
+          <w:t>G8 · Audit-Grade Financial Model</w:t>
+        </w:r>
+        <w:r>
+          <w:rPr>
+            <w:noProof/>
+          </w:rPr>
+          <w:tab/>
+          <w:fldChar w:fldCharType="begin"/>
+          <w:instrText xml:space="preserve"> PAGEREF _Toc2610221014 \h </w:instrText>
+          <w:fldChar w:fldCharType="separate"/>
+          <w:fldChar w:fldCharType="end"/>
+        </w:r>
+      </w:hyperlink>
+    </w:p>
+    <w:p>
+      <w:pPr>
+        <w:pStyle w:val="TOC2"/>
+        <w:tabs>
+          <w:tab w:val="right" w:leader="dot" w:pos="9350"/>
+        </w:tabs>
+      </w:pPr>
+      <w:hyperlink w:anchor="_Toc2610221015" w:history="1">
+        <w:r>
+          <w:rPr>
+            <w:noProof/>
+          </w:rPr>
+          <w:t>G9 · Permits Granted &amp; Appeal Risk Managed</w:t>
+        </w:r>
+        <w:r>
+          <w:rPr>
+            <w:noProof/>
+          </w:rPr>
+          <w:tab/>
+          <w:fldChar w:fldCharType="begin"/>
+          <w:instrText xml:space="preserve"> PAGEREF _Toc2610221015 \h </w:instrText>
+          <w:fldChar w:fldCharType="separate"/>
+          <w:fldChar w:fldCharType="end"/>
+        </w:r>
+      </w:hyperlink>
+    </w:p>
+    <w:p>
+      <w:pPr>
+        <w:pStyle w:val="TOC2"/>
+        <w:tabs>
+          <w:tab w:val="right" w:leader="dot" w:pos="9350"/>
+        </w:tabs>
+      </w:pPr>
+      <w:hyperlink w:anchor="_Toc2610221016" w:history="1">
+        <w:r>
+          <w:rPr>
+            <w:noProof/>
+          </w:rPr>
+          <w:t>G10 · Financial Close</w:t>
+        </w:r>
+        <w:r>
+          <w:rPr>
+            <w:noProof/>
+          </w:rPr>
+          <w:tab/>
+          <w:fldChar w:fldCharType="begin"/>
+          <w:instrText xml:space="preserve"> PAGEREF _Toc2610221016 \h </w:instrText>
+          <w:fldChar w:fldCharType="separate"/>
+          <w:fldChar w:fldCharType="end"/>
+        </w:r>
+      </w:hyperlink>
+    </w:p>
+    <w:p>
+      <w:pPr>
+        <w:pStyle w:val="TOC2"/>
+        <w:tabs>
+          <w:tab w:val="right" w:leader="dot" w:pos="9350"/>
+        </w:tabs>
+      </w:pPr>
+      <w:hyperlink w:anchor="_Toc2610221017" w:history="1">
+        <w:r>
+          <w:rPr>
+            <w:noProof/>
+          </w:rPr>
+          <w:t>G11 · COD &amp; Stabilization</w:t>
+        </w:r>
+        <w:r>
+          <w:rPr>
+            <w:noProof/>
+          </w:rPr>
+          <w:tab/>
+          <w:fldChar w:fldCharType="begin"/>
+          <w:instrText xml:space="preserve"> PAGEREF _Toc2610221017 \h </w:instrText>
+          <w:fldChar w:fldCharType="separate"/>
+          <w:fldChar w:fldCharType="end"/>
+        </w:r>
+      </w:hyperlink>
+    </w:p>
+    <w:p>
+      <w:pPr>
+        <w:pStyle w:val="TOC1"/>
+        <w:tabs>
+          <w:tab w:val="right" w:leader="dot" w:pos="9350"/>
+        </w:tabs>
+      </w:pPr>
+      <w:hyperlink w:anchor="_Toc2610221018" w:history="1">
+        <w:r>
+          <w:rPr>
+            <w:noProof/>
+          </w:rPr>
+          <w:t>7. Who does what</w:t>
+        </w:r>
+        <w:r>
+          <w:rPr>
+            <w:noProof/>
+          </w:rPr>
+          <w:tab/>
+          <w:fldChar w:fldCharType="begin"/>
+          <w:instrText xml:space="preserve"> PAGEREF _Toc2610221018 \h </w:instrText>
+          <w:fldChar w:fldCharType="separate"/>
+          <w:fldChar w:fldCharType="end"/>
+        </w:r>
+      </w:hyperlink>
+    </w:p>
+    <w:p>
+      <w:pPr>
+        <w:pStyle w:val="TOC1"/>
+        <w:tabs>
+          <w:tab w:val="right" w:leader="dot" w:pos="9350"/>
+        </w:tabs>
+      </w:pPr>
+      <w:hyperlink w:anchor="_Toc2610221019" w:history="1">
+        <w:r>
+          <w:rPr>
+            <w:noProof/>
+          </w:rPr>
+          <w:t>8. Getting started</w:t>
+        </w:r>
+        <w:r>
+          <w:rPr>
+            <w:noProof/>
+          </w:rPr>
+          <w:tab/>
+          <w:fldChar w:fldCharType="begin"/>
+          <w:instrText xml:space="preserve"> PAGEREF _Toc2610221019 \h </w:instrText>
+          <w:fldChar w:fldCharType="separate"/>
+          <w:fldChar w:fldCharType="end"/>
+        </w:r>
+      </w:hyperlink>
+    </w:p>
+    <w:p>
+      <w:r>
+        <w:fldChar w:fldCharType="end"/>
+        <w:br w:type="page"/>
+      </w:r>
+    </w:p>
+    <w:p>
+      <w:pPr>
         <w:pStyle w:val="Heading1"/>
         <w:keepNext/>
         <w:spacing w:before="360" w:after="160"/>
       </w:pPr>
+      <w:bookmarkStart w:id="1" w:name="_Toc2610221000"/>
       <w:r>
         <w:lastRenderedPageBreak/>
         <w:t>1. Why the gates exist</w:t>
       </w:r>
+      <w:bookmarkEnd w:id="1"/>
     </w:p>
     <w:p>
       <w:pPr>
@@ -739,9 +1283,11 @@
         <w:keepNext/>
         <w:spacing w:before="360" w:after="160"/>
       </w:pPr>
+      <w:bookmarkStart w:id="2" w:name="_Toc2610221001"/>
       <w:r>
         <w:t>2. How a gate works in GEX</w:t>
       </w:r>
+      <w:bookmarkEnd w:id="2"/>
     </w:p>
     <w:p>
       <w:pPr>
@@ -1021,9 +1567,11 @@
         <w:keepNext/>
         <w:spacing w:before="360" w:after="160"/>
       </w:pPr>
+      <w:bookmarkStart w:id="3" w:name="_Toc2610221002"/>
       <w:r>
         <w:t>3. Document stages</w:t>
       </w:r>
+      <w:bookmarkEnd w:id="3"/>
     </w:p>
     <w:p>
       <w:pPr>
@@ -1602,9 +2150,11 @@
         <w:keepNext/>
         <w:spacing w:before="360" w:after="160"/>
       </w:pPr>
+      <w:bookmarkStart w:id="4" w:name="_Toc2610221003"/>
       <w:r>
         <w:t>4. The path from idea to operation</w:t>
       </w:r>
+      <w:bookmarkEnd w:id="4"/>
     </w:p>
     <w:p>
       <w:pPr>
@@ -2468,9 +3018,11 @@
         <w:spacing w:before="360" w:after="160"/>
         <w:rPr/>
       </w:pPr>
+      <w:bookmarkStart w:id="5" w:name="_Toc2610221004"/>
       <w:r>
         <w:t>5. What GEX checks beyond documents</w:t>
       </w:r>
+      <w:bookmarkEnd w:id="5"/>
     </w:p>
     <w:p>
       <w:pPr>
@@ -3817,12 +4369,14 @@
         <w:keepNext/>
         <w:spacing w:before="360" w:after="160"/>
       </w:pPr>
+      <w:bookmarkStart w:id="6" w:name="_Toc2610221005"/>
       <w:r>
         <w:t>6</w:t>
       </w:r>
       <w:r>
         <w:t>. The twelve gates</w:t>
       </w:r>
+      <w:bookmarkEnd w:id="6"/>
     </w:p>
     <w:p>
       <w:pPr>
@@ -3919,9 +4473,11 @@
         <w:keepNext/>
         <w:spacing w:before="280" w:after="80"/>
       </w:pPr>
+      <w:bookmarkStart w:id="7" w:name="_Toc2610221006"/>
       <w:r>
         <w:t>G0 · Site Rights &amp; Social License</w:t>
       </w:r>
+      <w:bookmarkEnd w:id="7"/>
     </w:p>
     <w:p>
       <w:pPr>
@@ -4917,12 +5473,14 @@
         <w:keepNext/>
         <w:spacing w:before="280" w:after="80"/>
       </w:pPr>
+      <w:bookmarkStart w:id="8" w:name="_Toc2610221007"/>
       <w:r>
         <w:t xml:space="preserve">G1 · Power, </w:t>
       </w:r>
       <w:r>
         <w:t>Utilities &amp; Technology Basis</w:t>
       </w:r>
+      <w:bookmarkEnd w:id="8"/>
     </w:p>
     <w:p>
       <w:pPr>
@@ -7798,10 +8356,12 @@
         <w:keepNext/>
         <w:spacing w:before="280" w:after="80"/>
       </w:pPr>
+      <w:bookmarkStart w:id="9" w:name="_Toc2610221008"/>
       <w:r>
         <w:lastRenderedPageBreak/>
         <w:t>G2 · Green Certification Pathway</w:t>
       </w:r>
+      <w:bookmarkEnd w:id="9"/>
     </w:p>
     <w:p>
       <w:pPr>
@@ -9101,9 +9661,11 @@
         <w:keepNext/>
         <w:spacing w:before="280" w:after="80"/>
       </w:pPr>
+      <w:bookmarkStart w:id="10" w:name="_Toc2610221009"/>
       <w:r>
         <w:t>G3 · Feedstock &amp; Logistics Terms</w:t>
       </w:r>
+      <w:bookmarkEnd w:id="10"/>
     </w:p>
     <w:p>
       <w:pPr>
@@ -10181,10 +10743,12 @@
         <w:keepNext/>
         <w:spacing w:before="280" w:after="80"/>
       </w:pPr>
+      <w:bookmarkStart w:id="11" w:name="_Toc2610221010"/>
       <w:r>
         <w:lastRenderedPageBreak/>
         <w:t>G4 · Binding Offtake</w:t>
       </w:r>
+      <w:bookmarkEnd w:id="11"/>
     </w:p>
     <w:p>
       <w:pPr>
@@ -11907,9 +12471,11 @@
         <w:keepNext/>
         <w:spacing w:before="280" w:after="80"/>
       </w:pPr>
+      <w:bookmarkStart w:id="12" w:name="_Toc2610221011"/>
       <w:r>
         <w:t>G5 · EPC Risk Priced</w:t>
       </w:r>
+      <w:bookmarkEnd w:id="12"/>
     </w:p>
     <w:p>
       <w:pPr>
@@ -13951,10 +14517,12 @@
         <w:keepNext/>
         <w:spacing w:before="280" w:after="80"/>
       </w:pPr>
+      <w:bookmarkStart w:id="13" w:name="_Toc2610221012"/>
       <w:r>
         <w:lastRenderedPageBreak/>
         <w:t>G6 · Independent Engineer Sign-off</w:t>
       </w:r>
+      <w:bookmarkEnd w:id="13"/>
     </w:p>
     <w:p>
       <w:pPr>
@@ -15055,9 +15623,11 @@
         <w:keepNext/>
         <w:spacing w:before="280" w:after="80"/>
       </w:pPr>
+      <w:bookmarkStart w:id="14" w:name="_Toc2610221013"/>
       <w:r>
         <w:t>G7 · Insurability Confirmed</w:t>
       </w:r>
+      <w:bookmarkEnd w:id="14"/>
     </w:p>
     <w:p>
       <w:pPr>
@@ -16267,10 +16837,12 @@
         <w:keepNext/>
         <w:spacing w:before="280" w:after="80"/>
       </w:pPr>
+      <w:bookmarkStart w:id="15" w:name="_Toc2610221014"/>
       <w:r>
         <w:lastRenderedPageBreak/>
         <w:t>G8 · Audit-Grade Financial Model</w:t>
       </w:r>
+      <w:bookmarkEnd w:id="15"/>
     </w:p>
     <w:p>
       <w:pPr>
@@ -17593,9 +18165,11 @@
         <w:keepNext/>
         <w:spacing w:before="280" w:after="80"/>
       </w:pPr>
+      <w:bookmarkStart w:id="16" w:name="_Toc2610221015"/>
       <w:r>
         <w:t>G9 · Permits Granted &amp; Appeal Risk Managed</w:t>
       </w:r>
+      <w:bookmarkEnd w:id="16"/>
     </w:p>
     <w:p>
       <w:pPr>
@@ -18812,10 +19386,12 @@
         <w:keepNext/>
         <w:spacing w:before="280" w:after="80"/>
       </w:pPr>
+      <w:bookmarkStart w:id="17" w:name="_Toc2610221016"/>
       <w:r>
         <w:lastRenderedPageBreak/>
         <w:t>G10 · Financial Close</w:t>
       </w:r>
+      <w:bookmarkEnd w:id="17"/>
     </w:p>
     <w:p>
       <w:pPr>
@@ -20386,9 +20962,11 @@
         <w:keepNext/>
         <w:spacing w:before="280" w:after="80"/>
       </w:pPr>
+      <w:bookmarkStart w:id="18" w:name="_Toc2610221017"/>
       <w:r>
         <w:t>G11 · COD &amp; Stabilization</w:t>
       </w:r>
+      <w:bookmarkEnd w:id="18"/>
     </w:p>
     <w:p>
       <w:pPr>
@@ -21762,12 +22340,14 @@
         <w:keepNext/>
         <w:spacing w:before="360" w:after="160"/>
       </w:pPr>
+      <w:bookmarkStart w:id="19" w:name="_Toc2610221018"/>
       <w:r>
         <w:t>7</w:t>
       </w:r>
       <w:r>
         <w:t>. Who does what</w:t>
       </w:r>
+      <w:bookmarkEnd w:id="19"/>
     </w:p>
     <w:p>
       <w:pPr>
@@ -22372,12 +22952,14 @@
         <w:keepNext/>
         <w:spacing w:before="360" w:after="160"/>
       </w:pPr>
+      <w:bookmarkStart w:id="20" w:name="_Toc2610221019"/>
       <w:r>
         <w:t>8</w:t>
       </w:r>
       <w:r>
         <w:t>. Getting started</w:t>
       </w:r>
+      <w:bookmarkEnd w:id="20"/>
     </w:p>
     <w:p>
       <w:pPr>
@@ -23470,6 +24052,40 @@
       <w:szCs w:val="20"/>
     </w:rPr>
   </w:style>
+  <w:style w:type="paragraph" w:styleId="TOCHeading">
+    <w:name w:val="TOC Heading"/>
+    <w:basedOn w:val="Heading1"/>
+    <w:next w:val="Normal"/>
+    <w:uiPriority w:val="39"/>
+    <w:unhideWhenUsed/>
+    <w:pPr>
+      <w:outlineLvl w:val="9"/>
+    </w:pPr>
+  </w:style>
+  <w:style w:type="paragraph" w:styleId="TOC1">
+    <w:name w:val="toc 1"/>
+    <w:basedOn w:val="Normal"/>
+    <w:next w:val="Normal"/>
+    <w:uiPriority w:val="39"/>
+    <w:unhideWhenUsed/>
+    <w:pPr>
+      <w:spacing w:before="120" w:after="40"/>
+    </w:pPr>
+    <w:rPr>
+      <w:b/>
+    </w:rPr>
+  </w:style>
+  <w:style w:type="paragraph" w:styleId="TOC2">
+    <w:name w:val="toc 2"/>
+    <w:basedOn w:val="Normal"/>
+    <w:next w:val="Normal"/>
+    <w:uiPriority w:val="39"/>
+    <w:unhideWhenUsed/>
+    <w:pPr>
+      <w:spacing w:before="0" w:after="40"/>
+      <w:ind w:left="240"/>
+    </w:pPr>
+  </w:style>
 </w:styles>
 </file>
 

</xml_diff>